<commit_message>
Update SD2 project files and add new content
</commit_message>
<xml_diff>
--- a/docs/Extras/SD2_S26/Bill-of-Materials-and-Budget/PRP BOM.docx
+++ b/docs/Extras/SD2_S26/Bill-of-Materials-and-Budget/PRP BOM.docx
@@ -26965,6 +26965,802 @@
               </w:rPr>
               <w:t xml:space="preserve">68.07</w:t>
             </w:r>
+            <w:r>
+              <w:rPr>
+                <w:rtl w:val="0"/>
+              </w:rPr>
+            </w:r>
+          </w:p>
+        </w:tc>
+      </w:tr>
+      <w:tr>
+        <w:trPr>
+          <w:cantSplit w:val="0"/>
+          <w:trHeight w:val="285" w:hRule="atLeast"/>
+          <w:tblHeader w:val="0"/>
+        </w:trPr>
+        <w:tc>
+          <w:tcPr>
+            <w:tcBorders>
+              <w:top w:color="cccccc" w:space="0" w:sz="5" w:val="single"/>
+              <w:left w:color="000000" w:space="0" w:sz="5" w:val="single"/>
+              <w:bottom w:color="000000" w:space="0" w:sz="5" w:val="single"/>
+              <w:right w:color="000000" w:space="0" w:sz="5" w:val="single"/>
+            </w:tcBorders>
+            <w:shd w:fill="auto" w:val="clear"/>
+            <w:tcMar>
+              <w:top w:w="0.0" w:type="dxa"/>
+              <w:left w:w="40.0" w:type="dxa"/>
+              <w:bottom w:w="0.0" w:type="dxa"/>
+              <w:right w:w="40.0" w:type="dxa"/>
+            </w:tcMar>
+            <w:vAlign w:val="bottom"/>
+          </w:tcPr>
+          <w:p>
+            <w:pPr>
+              <w:widowControl w:val="0"/>
+              <w:jc w:val="right"/>
+              <w:rPr>
+                <w:sz w:val="16"/>
+                <w:szCs w:val="16"/>
+              </w:rPr>
+            </w:pPr>
+            <w:r>
+              <w:rPr>
+                <w:rtl w:val="0"/>
+              </w:rPr>
+            </w:r>
+          </w:p>
+        </w:tc>
+        <w:tc>
+          <w:tcPr>
+            <w:tcBorders>
+              <w:top w:color="cccccc" w:space="0" w:sz="5" w:val="single"/>
+              <w:left w:color="cccccc" w:space="0" w:sz="5" w:val="single"/>
+              <w:bottom w:color="000000" w:space="0" w:sz="5" w:val="single"/>
+              <w:right w:color="000000" w:space="0" w:sz="5" w:val="single"/>
+            </w:tcBorders>
+            <w:shd w:fill="auto" w:val="clear"/>
+            <w:tcMar>
+              <w:top w:w="0.0" w:type="dxa"/>
+              <w:left w:w="40.0" w:type="dxa"/>
+              <w:bottom w:w="0.0" w:type="dxa"/>
+              <w:right w:w="40.0" w:type="dxa"/>
+            </w:tcMar>
+            <w:vAlign w:val="bottom"/>
+          </w:tcPr>
+          <w:p>
+            <w:pPr>
+              <w:widowControl w:val="0"/>
+              <w:rPr>
+                <w:sz w:val="16"/>
+                <w:szCs w:val="16"/>
+              </w:rPr>
+            </w:pPr>
+            <w:r>
+              <w:rPr>
+                <w:rtl w:val="0"/>
+              </w:rPr>
+            </w:r>
+          </w:p>
+        </w:tc>
+        <w:tc>
+          <w:tcPr>
+            <w:tcBorders>
+              <w:top w:color="cccccc" w:space="0" w:sz="5" w:val="single"/>
+              <w:left w:color="cccccc" w:space="0" w:sz="5" w:val="single"/>
+              <w:bottom w:color="000000" w:space="0" w:sz="5" w:val="single"/>
+              <w:right w:color="000000" w:space="0" w:sz="5" w:val="single"/>
+            </w:tcBorders>
+            <w:shd w:fill="auto" w:val="clear"/>
+            <w:tcMar>
+              <w:top w:w="0.0" w:type="dxa"/>
+              <w:left w:w="40.0" w:type="dxa"/>
+              <w:bottom w:w="0.0" w:type="dxa"/>
+              <w:right w:w="40.0" w:type="dxa"/>
+            </w:tcMar>
+            <w:vAlign w:val="bottom"/>
+          </w:tcPr>
+          <w:p>
+            <w:pPr>
+              <w:widowControl w:val="0"/>
+              <w:rPr/>
+            </w:pPr>
+            <w:r>
+              <w:rPr>
+                <w:rtl w:val="0"/>
+              </w:rPr>
+            </w:r>
+          </w:p>
+        </w:tc>
+        <w:tc>
+          <w:tcPr>
+            <w:tcBorders>
+              <w:top w:color="cccccc" w:space="0" w:sz="5" w:val="single"/>
+              <w:left w:color="cccccc" w:space="0" w:sz="5" w:val="single"/>
+              <w:bottom w:color="000000" w:space="0" w:sz="5" w:val="single"/>
+              <w:right w:color="000000" w:space="0" w:sz="5" w:val="single"/>
+            </w:tcBorders>
+            <w:shd w:fill="auto" w:val="clear"/>
+            <w:tcMar>
+              <w:top w:w="0.0" w:type="dxa"/>
+              <w:left w:w="40.0" w:type="dxa"/>
+              <w:bottom w:w="0.0" w:type="dxa"/>
+              <w:right w:w="40.0" w:type="dxa"/>
+            </w:tcMar>
+            <w:vAlign w:val="bottom"/>
+          </w:tcPr>
+          <w:p>
+            <w:pPr>
+              <w:widowControl w:val="0"/>
+              <w:rPr>
+                <w:sz w:val="16"/>
+                <w:szCs w:val="16"/>
+              </w:rPr>
+            </w:pPr>
+            <w:r>
+              <w:rPr>
+                <w:rtl w:val="0"/>
+              </w:rPr>
+            </w:r>
+          </w:p>
+        </w:tc>
+        <w:tc>
+          <w:tcPr>
+            <w:tcBorders>
+              <w:top w:color="cccccc" w:space="0" w:sz="5" w:val="single"/>
+              <w:left w:color="cccccc" w:space="0" w:sz="5" w:val="single"/>
+              <w:bottom w:color="000000" w:space="0" w:sz="5" w:val="single"/>
+              <w:right w:color="000000" w:space="0" w:sz="5" w:val="single"/>
+            </w:tcBorders>
+            <w:shd w:fill="auto" w:val="clear"/>
+            <w:tcMar>
+              <w:top w:w="0.0" w:type="dxa"/>
+              <w:left w:w="40.0" w:type="dxa"/>
+              <w:bottom w:w="0.0" w:type="dxa"/>
+              <w:right w:w="40.0" w:type="dxa"/>
+            </w:tcMar>
+            <w:vAlign w:val="bottom"/>
+          </w:tcPr>
+          <w:p>
+            <w:pPr>
+              <w:widowControl w:val="0"/>
+              <w:jc w:val="right"/>
+              <w:rPr>
+                <w:sz w:val="16"/>
+                <w:szCs w:val="16"/>
+              </w:rPr>
+            </w:pPr>
+            <w:r>
+              <w:rPr>
+                <w:rtl w:val="0"/>
+              </w:rPr>
+            </w:r>
+          </w:p>
+        </w:tc>
+        <w:tc>
+          <w:tcPr>
+            <w:tcBorders>
+              <w:top w:color="cccccc" w:space="0" w:sz="5" w:val="single"/>
+              <w:left w:color="cccccc" w:space="0" w:sz="5" w:val="single"/>
+              <w:bottom w:color="000000" w:space="0" w:sz="5" w:val="single"/>
+              <w:right w:color="000000" w:space="0" w:sz="5" w:val="single"/>
+            </w:tcBorders>
+            <w:shd w:fill="auto" w:val="clear"/>
+            <w:tcMar>
+              <w:top w:w="0.0" w:type="dxa"/>
+              <w:left w:w="40.0" w:type="dxa"/>
+              <w:bottom w:w="0.0" w:type="dxa"/>
+              <w:right w:w="40.0" w:type="dxa"/>
+            </w:tcMar>
+            <w:vAlign w:val="bottom"/>
+          </w:tcPr>
+          <w:p>
+            <w:pPr>
+              <w:widowControl w:val="0"/>
+              <w:jc w:val="right"/>
+              <w:rPr>
+                <w:sz w:val="16"/>
+                <w:szCs w:val="16"/>
+              </w:rPr>
+            </w:pPr>
+            <w:r>
+              <w:rPr>
+                <w:rtl w:val="0"/>
+              </w:rPr>
+            </w:r>
+          </w:p>
+        </w:tc>
+      </w:tr>
+      <w:tr>
+        <w:trPr>
+          <w:cantSplit w:val="0"/>
+          <w:trHeight w:val="285" w:hRule="atLeast"/>
+          <w:tblHeader w:val="0"/>
+        </w:trPr>
+        <w:tc>
+          <w:tcPr>
+            <w:tcBorders>
+              <w:top w:color="cccccc" w:space="0" w:sz="5" w:val="single"/>
+              <w:left w:color="000000" w:space="0" w:sz="5" w:val="single"/>
+              <w:bottom w:color="000000" w:space="0" w:sz="5" w:val="single"/>
+              <w:right w:color="000000" w:space="0" w:sz="5" w:val="single"/>
+            </w:tcBorders>
+            <w:shd w:fill="auto" w:val="clear"/>
+            <w:tcMar>
+              <w:top w:w="0.0" w:type="dxa"/>
+              <w:left w:w="40.0" w:type="dxa"/>
+              <w:bottom w:w="0.0" w:type="dxa"/>
+              <w:right w:w="40.0" w:type="dxa"/>
+            </w:tcMar>
+            <w:vAlign w:val="bottom"/>
+          </w:tcPr>
+          <w:p>
+            <w:pPr>
+              <w:widowControl w:val="0"/>
+              <w:jc w:val="right"/>
+              <w:rPr>
+                <w:sz w:val="16"/>
+                <w:szCs w:val="16"/>
+              </w:rPr>
+            </w:pPr>
+            <w:r>
+              <w:rPr>
+                <w:rtl w:val="0"/>
+              </w:rPr>
+            </w:r>
+          </w:p>
+        </w:tc>
+        <w:tc>
+          <w:tcPr>
+            <w:tcBorders>
+              <w:top w:color="cccccc" w:space="0" w:sz="5" w:val="single"/>
+              <w:left w:color="cccccc" w:space="0" w:sz="5" w:val="single"/>
+              <w:bottom w:color="000000" w:space="0" w:sz="5" w:val="single"/>
+              <w:right w:color="000000" w:space="0" w:sz="5" w:val="single"/>
+            </w:tcBorders>
+            <w:shd w:fill="auto" w:val="clear"/>
+            <w:tcMar>
+              <w:top w:w="0.0" w:type="dxa"/>
+              <w:left w:w="40.0" w:type="dxa"/>
+              <w:bottom w:w="0.0" w:type="dxa"/>
+              <w:right w:w="40.0" w:type="dxa"/>
+            </w:tcMar>
+            <w:vAlign w:val="bottom"/>
+          </w:tcPr>
+          <w:p>
+            <w:pPr>
+              <w:widowControl w:val="0"/>
+              <w:rPr>
+                <w:sz w:val="16"/>
+                <w:szCs w:val="16"/>
+              </w:rPr>
+            </w:pPr>
+            <w:r>
+              <w:rPr>
+                <w:rtl w:val="0"/>
+              </w:rPr>
+            </w:r>
+          </w:p>
+        </w:tc>
+        <w:tc>
+          <w:tcPr>
+            <w:tcBorders>
+              <w:top w:color="cccccc" w:space="0" w:sz="5" w:val="single"/>
+              <w:left w:color="cccccc" w:space="0" w:sz="5" w:val="single"/>
+              <w:bottom w:color="000000" w:space="0" w:sz="5" w:val="single"/>
+              <w:right w:color="000000" w:space="0" w:sz="5" w:val="single"/>
+            </w:tcBorders>
+            <w:shd w:fill="auto" w:val="clear"/>
+            <w:tcMar>
+              <w:top w:w="0.0" w:type="dxa"/>
+              <w:left w:w="40.0" w:type="dxa"/>
+              <w:bottom w:w="0.0" w:type="dxa"/>
+              <w:right w:w="40.0" w:type="dxa"/>
+            </w:tcMar>
+            <w:vAlign w:val="bottom"/>
+          </w:tcPr>
+          <w:p>
+            <w:pPr>
+              <w:widowControl w:val="0"/>
+              <w:rPr/>
+            </w:pPr>
+            <w:r>
+              <w:rPr>
+                <w:rtl w:val="0"/>
+              </w:rPr>
+            </w:r>
+          </w:p>
+        </w:tc>
+        <w:tc>
+          <w:tcPr>
+            <w:tcBorders>
+              <w:top w:color="cccccc" w:space="0" w:sz="5" w:val="single"/>
+              <w:left w:color="cccccc" w:space="0" w:sz="5" w:val="single"/>
+              <w:bottom w:color="000000" w:space="0" w:sz="5" w:val="single"/>
+              <w:right w:color="000000" w:space="0" w:sz="5" w:val="single"/>
+            </w:tcBorders>
+            <w:shd w:fill="auto" w:val="clear"/>
+            <w:tcMar>
+              <w:top w:w="0.0" w:type="dxa"/>
+              <w:left w:w="40.0" w:type="dxa"/>
+              <w:bottom w:w="0.0" w:type="dxa"/>
+              <w:right w:w="40.0" w:type="dxa"/>
+            </w:tcMar>
+            <w:vAlign w:val="bottom"/>
+          </w:tcPr>
+          <w:p>
+            <w:pPr>
+              <w:widowControl w:val="0"/>
+              <w:rPr>
+                <w:sz w:val="16"/>
+                <w:szCs w:val="16"/>
+              </w:rPr>
+            </w:pPr>
+            <w:r>
+              <w:rPr>
+                <w:rtl w:val="0"/>
+              </w:rPr>
+            </w:r>
+          </w:p>
+        </w:tc>
+        <w:tc>
+          <w:tcPr>
+            <w:tcBorders>
+              <w:top w:color="cccccc" w:space="0" w:sz="5" w:val="single"/>
+              <w:left w:color="cccccc" w:space="0" w:sz="5" w:val="single"/>
+              <w:bottom w:color="000000" w:space="0" w:sz="5" w:val="single"/>
+              <w:right w:color="000000" w:space="0" w:sz="5" w:val="single"/>
+            </w:tcBorders>
+            <w:shd w:fill="auto" w:val="clear"/>
+            <w:tcMar>
+              <w:top w:w="0.0" w:type="dxa"/>
+              <w:left w:w="40.0" w:type="dxa"/>
+              <w:bottom w:w="0.0" w:type="dxa"/>
+              <w:right w:w="40.0" w:type="dxa"/>
+            </w:tcMar>
+            <w:vAlign w:val="bottom"/>
+          </w:tcPr>
+          <w:p>
+            <w:pPr>
+              <w:widowControl w:val="0"/>
+              <w:jc w:val="right"/>
+              <w:rPr>
+                <w:sz w:val="16"/>
+                <w:szCs w:val="16"/>
+              </w:rPr>
+            </w:pPr>
+            <w:r>
+              <w:rPr>
+                <w:rtl w:val="0"/>
+              </w:rPr>
+            </w:r>
+          </w:p>
+        </w:tc>
+        <w:tc>
+          <w:tcPr>
+            <w:tcBorders>
+              <w:top w:color="cccccc" w:space="0" w:sz="5" w:val="single"/>
+              <w:left w:color="cccccc" w:space="0" w:sz="5" w:val="single"/>
+              <w:bottom w:color="000000" w:space="0" w:sz="5" w:val="single"/>
+              <w:right w:color="000000" w:space="0" w:sz="5" w:val="single"/>
+            </w:tcBorders>
+            <w:shd w:fill="auto" w:val="clear"/>
+            <w:tcMar>
+              <w:top w:w="0.0" w:type="dxa"/>
+              <w:left w:w="40.0" w:type="dxa"/>
+              <w:bottom w:w="0.0" w:type="dxa"/>
+              <w:right w:w="40.0" w:type="dxa"/>
+            </w:tcMar>
+            <w:vAlign w:val="bottom"/>
+          </w:tcPr>
+          <w:p>
+            <w:pPr>
+              <w:widowControl w:val="0"/>
+              <w:jc w:val="right"/>
+              <w:rPr>
+                <w:sz w:val="16"/>
+                <w:szCs w:val="16"/>
+              </w:rPr>
+            </w:pPr>
+            <w:r>
+              <w:rPr>
+                <w:rtl w:val="0"/>
+              </w:rPr>
+            </w:r>
+          </w:p>
+        </w:tc>
+      </w:tr>
+      <w:tr>
+        <w:trPr>
+          <w:cantSplit w:val="0"/>
+          <w:trHeight w:val="285" w:hRule="atLeast"/>
+          <w:tblHeader w:val="0"/>
+        </w:trPr>
+        <w:tc>
+          <w:tcPr>
+            <w:tcBorders>
+              <w:top w:color="cccccc" w:space="0" w:sz="5" w:val="single"/>
+              <w:left w:color="000000" w:space="0" w:sz="5" w:val="single"/>
+              <w:bottom w:color="000000" w:space="0" w:sz="5" w:val="single"/>
+              <w:right w:color="000000" w:space="0" w:sz="5" w:val="single"/>
+            </w:tcBorders>
+            <w:shd w:fill="auto" w:val="clear"/>
+            <w:tcMar>
+              <w:top w:w="0.0" w:type="dxa"/>
+              <w:left w:w="40.0" w:type="dxa"/>
+              <w:bottom w:w="0.0" w:type="dxa"/>
+              <w:right w:w="40.0" w:type="dxa"/>
+            </w:tcMar>
+            <w:vAlign w:val="bottom"/>
+          </w:tcPr>
+          <w:p>
+            <w:pPr>
+              <w:widowControl w:val="0"/>
+              <w:jc w:val="right"/>
+              <w:rPr>
+                <w:sz w:val="16"/>
+                <w:szCs w:val="16"/>
+              </w:rPr>
+            </w:pPr>
+            <w:r>
+              <w:rPr>
+                <w:rtl w:val="0"/>
+              </w:rPr>
+            </w:r>
+          </w:p>
+        </w:tc>
+        <w:tc>
+          <w:tcPr>
+            <w:tcBorders>
+              <w:top w:color="cccccc" w:space="0" w:sz="5" w:val="single"/>
+              <w:left w:color="cccccc" w:space="0" w:sz="5" w:val="single"/>
+              <w:bottom w:color="000000" w:space="0" w:sz="5" w:val="single"/>
+              <w:right w:color="000000" w:space="0" w:sz="5" w:val="single"/>
+            </w:tcBorders>
+            <w:shd w:fill="auto" w:val="clear"/>
+            <w:tcMar>
+              <w:top w:w="0.0" w:type="dxa"/>
+              <w:left w:w="40.0" w:type="dxa"/>
+              <w:bottom w:w="0.0" w:type="dxa"/>
+              <w:right w:w="40.0" w:type="dxa"/>
+            </w:tcMar>
+            <w:vAlign w:val="bottom"/>
+          </w:tcPr>
+          <w:p>
+            <w:pPr>
+              <w:widowControl w:val="0"/>
+              <w:rPr>
+                <w:sz w:val="16"/>
+                <w:szCs w:val="16"/>
+              </w:rPr>
+            </w:pPr>
+            <w:r>
+              <w:rPr>
+                <w:rtl w:val="0"/>
+              </w:rPr>
+            </w:r>
+          </w:p>
+        </w:tc>
+        <w:tc>
+          <w:tcPr>
+            <w:tcBorders>
+              <w:top w:color="cccccc" w:space="0" w:sz="5" w:val="single"/>
+              <w:left w:color="cccccc" w:space="0" w:sz="5" w:val="single"/>
+              <w:bottom w:color="000000" w:space="0" w:sz="5" w:val="single"/>
+              <w:right w:color="000000" w:space="0" w:sz="5" w:val="single"/>
+            </w:tcBorders>
+            <w:shd w:fill="auto" w:val="clear"/>
+            <w:tcMar>
+              <w:top w:w="0.0" w:type="dxa"/>
+              <w:left w:w="40.0" w:type="dxa"/>
+              <w:bottom w:w="0.0" w:type="dxa"/>
+              <w:right w:w="40.0" w:type="dxa"/>
+            </w:tcMar>
+            <w:vAlign w:val="bottom"/>
+          </w:tcPr>
+          <w:p>
+            <w:pPr>
+              <w:widowControl w:val="0"/>
+              <w:rPr/>
+            </w:pPr>
+            <w:r>
+              <w:rPr>
+                <w:rtl w:val="0"/>
+              </w:rPr>
+            </w:r>
+          </w:p>
+        </w:tc>
+        <w:tc>
+          <w:tcPr>
+            <w:tcBorders>
+              <w:top w:color="cccccc" w:space="0" w:sz="5" w:val="single"/>
+              <w:left w:color="cccccc" w:space="0" w:sz="5" w:val="single"/>
+              <w:bottom w:color="000000" w:space="0" w:sz="5" w:val="single"/>
+              <w:right w:color="000000" w:space="0" w:sz="5" w:val="single"/>
+            </w:tcBorders>
+            <w:shd w:fill="auto" w:val="clear"/>
+            <w:tcMar>
+              <w:top w:w="0.0" w:type="dxa"/>
+              <w:left w:w="40.0" w:type="dxa"/>
+              <w:bottom w:w="0.0" w:type="dxa"/>
+              <w:right w:w="40.0" w:type="dxa"/>
+            </w:tcMar>
+            <w:vAlign w:val="bottom"/>
+          </w:tcPr>
+          <w:p>
+            <w:pPr>
+              <w:widowControl w:val="0"/>
+              <w:rPr>
+                <w:sz w:val="16"/>
+                <w:szCs w:val="16"/>
+              </w:rPr>
+            </w:pPr>
+            <w:r>
+              <w:rPr>
+                <w:rtl w:val="0"/>
+              </w:rPr>
+            </w:r>
+          </w:p>
+        </w:tc>
+        <w:tc>
+          <w:tcPr>
+            <w:tcBorders>
+              <w:top w:color="cccccc" w:space="0" w:sz="5" w:val="single"/>
+              <w:left w:color="cccccc" w:space="0" w:sz="5" w:val="single"/>
+              <w:bottom w:color="000000" w:space="0" w:sz="5" w:val="single"/>
+              <w:right w:color="000000" w:space="0" w:sz="5" w:val="single"/>
+            </w:tcBorders>
+            <w:shd w:fill="auto" w:val="clear"/>
+            <w:tcMar>
+              <w:top w:w="0.0" w:type="dxa"/>
+              <w:left w:w="40.0" w:type="dxa"/>
+              <w:bottom w:w="0.0" w:type="dxa"/>
+              <w:right w:w="40.0" w:type="dxa"/>
+            </w:tcMar>
+            <w:vAlign w:val="bottom"/>
+          </w:tcPr>
+          <w:p>
+            <w:pPr>
+              <w:widowControl w:val="0"/>
+              <w:jc w:val="right"/>
+              <w:rPr>
+                <w:sz w:val="16"/>
+                <w:szCs w:val="16"/>
+              </w:rPr>
+            </w:pPr>
+            <w:r>
+              <w:rPr>
+                <w:rtl w:val="0"/>
+              </w:rPr>
+            </w:r>
+          </w:p>
+        </w:tc>
+        <w:tc>
+          <w:tcPr>
+            <w:tcBorders>
+              <w:top w:color="cccccc" w:space="0" w:sz="5" w:val="single"/>
+              <w:left w:color="cccccc" w:space="0" w:sz="5" w:val="single"/>
+              <w:bottom w:color="000000" w:space="0" w:sz="5" w:val="single"/>
+              <w:right w:color="000000" w:space="0" w:sz="5" w:val="single"/>
+            </w:tcBorders>
+            <w:shd w:fill="auto" w:val="clear"/>
+            <w:tcMar>
+              <w:top w:w="0.0" w:type="dxa"/>
+              <w:left w:w="40.0" w:type="dxa"/>
+              <w:bottom w:w="0.0" w:type="dxa"/>
+              <w:right w:w="40.0" w:type="dxa"/>
+            </w:tcMar>
+            <w:vAlign w:val="bottom"/>
+          </w:tcPr>
+          <w:p>
+            <w:pPr>
+              <w:widowControl w:val="0"/>
+              <w:jc w:val="right"/>
+              <w:rPr>
+                <w:sz w:val="16"/>
+                <w:szCs w:val="16"/>
+              </w:rPr>
+            </w:pPr>
+            <w:r>
+              <w:rPr>
+                <w:rtl w:val="0"/>
+              </w:rPr>
+            </w:r>
+          </w:p>
+        </w:tc>
+      </w:tr>
+      <w:tr>
+        <w:trPr>
+          <w:cantSplit w:val="0"/>
+          <w:trHeight w:val="285" w:hRule="atLeast"/>
+          <w:tblHeader w:val="0"/>
+        </w:trPr>
+        <w:tc>
+          <w:tcPr>
+            <w:tcBorders>
+              <w:top w:color="cccccc" w:space="0" w:sz="5" w:val="single"/>
+              <w:left w:color="000000" w:space="0" w:sz="5" w:val="single"/>
+              <w:bottom w:color="000000" w:space="0" w:sz="5" w:val="single"/>
+              <w:right w:color="000000" w:space="0" w:sz="5" w:val="single"/>
+            </w:tcBorders>
+            <w:shd w:fill="auto" w:val="clear"/>
+            <w:tcMar>
+              <w:top w:w="0.0" w:type="dxa"/>
+              <w:left w:w="40.0" w:type="dxa"/>
+              <w:bottom w:w="0.0" w:type="dxa"/>
+              <w:right w:w="40.0" w:type="dxa"/>
+            </w:tcMar>
+            <w:vAlign w:val="bottom"/>
+          </w:tcPr>
+          <w:p>
+            <w:pPr>
+              <w:widowControl w:val="0"/>
+              <w:jc w:val="right"/>
+              <w:rPr>
+                <w:sz w:val="16"/>
+                <w:szCs w:val="16"/>
+              </w:rPr>
+            </w:pPr>
+            <w:r>
+              <w:rPr>
+                <w:rtl w:val="0"/>
+              </w:rPr>
+            </w:r>
+          </w:p>
+        </w:tc>
+        <w:tc>
+          <w:tcPr>
+            <w:tcBorders>
+              <w:top w:color="cccccc" w:space="0" w:sz="5" w:val="single"/>
+              <w:left w:color="cccccc" w:space="0" w:sz="5" w:val="single"/>
+              <w:bottom w:color="000000" w:space="0" w:sz="5" w:val="single"/>
+              <w:right w:color="000000" w:space="0" w:sz="5" w:val="single"/>
+            </w:tcBorders>
+            <w:shd w:fill="auto" w:val="clear"/>
+            <w:tcMar>
+              <w:top w:w="0.0" w:type="dxa"/>
+              <w:left w:w="40.0" w:type="dxa"/>
+              <w:bottom w:w="0.0" w:type="dxa"/>
+              <w:right w:w="40.0" w:type="dxa"/>
+            </w:tcMar>
+            <w:vAlign w:val="bottom"/>
+          </w:tcPr>
+          <w:p>
+            <w:pPr>
+              <w:widowControl w:val="0"/>
+              <w:rPr>
+                <w:sz w:val="16"/>
+                <w:szCs w:val="16"/>
+              </w:rPr>
+            </w:pPr>
+            <w:r>
+              <w:rPr>
+                <w:rtl w:val="0"/>
+              </w:rPr>
+            </w:r>
+          </w:p>
+        </w:tc>
+        <w:tc>
+          <w:tcPr>
+            <w:tcBorders>
+              <w:top w:color="cccccc" w:space="0" w:sz="5" w:val="single"/>
+              <w:left w:color="cccccc" w:space="0" w:sz="5" w:val="single"/>
+              <w:bottom w:color="000000" w:space="0" w:sz="5" w:val="single"/>
+              <w:right w:color="000000" w:space="0" w:sz="5" w:val="single"/>
+            </w:tcBorders>
+            <w:shd w:fill="auto" w:val="clear"/>
+            <w:tcMar>
+              <w:top w:w="0.0" w:type="dxa"/>
+              <w:left w:w="40.0" w:type="dxa"/>
+              <w:bottom w:w="0.0" w:type="dxa"/>
+              <w:right w:w="40.0" w:type="dxa"/>
+            </w:tcMar>
+            <w:vAlign w:val="bottom"/>
+          </w:tcPr>
+          <w:p>
+            <w:pPr>
+              <w:widowControl w:val="0"/>
+              <w:rPr/>
+            </w:pPr>
+            <w:r>
+              <w:rPr>
+                <w:rtl w:val="0"/>
+              </w:rPr>
+            </w:r>
+          </w:p>
+        </w:tc>
+        <w:tc>
+          <w:tcPr>
+            <w:tcBorders>
+              <w:top w:color="cccccc" w:space="0" w:sz="5" w:val="single"/>
+              <w:left w:color="cccccc" w:space="0" w:sz="5" w:val="single"/>
+              <w:bottom w:color="000000" w:space="0" w:sz="5" w:val="single"/>
+              <w:right w:color="000000" w:space="0" w:sz="5" w:val="single"/>
+            </w:tcBorders>
+            <w:shd w:fill="auto" w:val="clear"/>
+            <w:tcMar>
+              <w:top w:w="0.0" w:type="dxa"/>
+              <w:left w:w="40.0" w:type="dxa"/>
+              <w:bottom w:w="0.0" w:type="dxa"/>
+              <w:right w:w="40.0" w:type="dxa"/>
+            </w:tcMar>
+            <w:vAlign w:val="bottom"/>
+          </w:tcPr>
+          <w:p>
+            <w:pPr>
+              <w:widowControl w:val="0"/>
+              <w:rPr>
+                <w:sz w:val="16"/>
+                <w:szCs w:val="16"/>
+              </w:rPr>
+            </w:pPr>
+            <w:r>
+              <w:rPr>
+                <w:rtl w:val="0"/>
+              </w:rPr>
+            </w:r>
+          </w:p>
+        </w:tc>
+        <w:tc>
+          <w:tcPr>
+            <w:tcBorders>
+              <w:top w:color="cccccc" w:space="0" w:sz="5" w:val="single"/>
+              <w:left w:color="cccccc" w:space="0" w:sz="5" w:val="single"/>
+              <w:bottom w:color="000000" w:space="0" w:sz="5" w:val="single"/>
+              <w:right w:color="000000" w:space="0" w:sz="5" w:val="single"/>
+            </w:tcBorders>
+            <w:shd w:fill="auto" w:val="clear"/>
+            <w:tcMar>
+              <w:top w:w="0.0" w:type="dxa"/>
+              <w:left w:w="40.0" w:type="dxa"/>
+              <w:bottom w:w="0.0" w:type="dxa"/>
+              <w:right w:w="40.0" w:type="dxa"/>
+            </w:tcMar>
+            <w:vAlign w:val="bottom"/>
+          </w:tcPr>
+          <w:p>
+            <w:pPr>
+              <w:widowControl w:val="0"/>
+              <w:jc w:val="right"/>
+              <w:rPr>
+                <w:sz w:val="16"/>
+                <w:szCs w:val="16"/>
+              </w:rPr>
+            </w:pPr>
+            <w:r>
+              <w:rPr>
+                <w:rtl w:val="0"/>
+              </w:rPr>
+            </w:r>
+          </w:p>
+        </w:tc>
+        <w:tc>
+          <w:tcPr>
+            <w:tcBorders>
+              <w:top w:color="cccccc" w:space="0" w:sz="5" w:val="single"/>
+              <w:left w:color="cccccc" w:space="0" w:sz="5" w:val="single"/>
+              <w:bottom w:color="000000" w:space="0" w:sz="5" w:val="single"/>
+              <w:right w:color="000000" w:space="0" w:sz="5" w:val="single"/>
+            </w:tcBorders>
+            <w:shd w:fill="auto" w:val="clear"/>
+            <w:tcMar>
+              <w:top w:w="0.0" w:type="dxa"/>
+              <w:left w:w="40.0" w:type="dxa"/>
+              <w:bottom w:w="0.0" w:type="dxa"/>
+              <w:right w:w="40.0" w:type="dxa"/>
+            </w:tcMar>
+            <w:vAlign w:val="bottom"/>
+          </w:tcPr>
+          <w:p>
+            <w:pPr>
+              <w:widowControl w:val="0"/>
+              <w:jc w:val="right"/>
+              <w:rPr>
+                <w:sz w:val="16"/>
+                <w:szCs w:val="16"/>
+              </w:rPr>
+            </w:pPr>
             <w:r>
               <w:rPr>
                 <w:rtl w:val="0"/>

</xml_diff>